<commit_message>
SAJE revision: denser paragraphs trimmed, notes shortened, letter quotes aligned
Co-Authored-By: Claude Opus 5.5 <noreply@anthropic.com>
Claude-Session: https://claude.ai/code/session_01Ny4MKFPCnQG8RbtvfHQ86Z
</commit_message>
<xml_diff>
--- a/SAJE_292892_revision/build_r2/02_Manuscript_Revised_Marked_blue.docx
+++ b/SAJE_292892_revision/build_r2/02_Manuscript_Revised_Marked_blue.docx
@@ -8567,13 +8567,23 @@
       </w:pPr>
       <w:r>
         <w:rPr/>
-        <w:t xml:space="preserve">Table 1 compares scored firms in the base year with never-scored firm-years in the sample. Scored firms are larger: their median market capitalization is 203.2 million U.S. dollars against 42.2 million, and their median total assets are 4.3 times as large, with normalized differences of 0.69 and 0.61. </w:t>
-      </w:r>
-      <w:r>
-        <w:rPr>
-          <w:color w:val="0000FF"/>
-        </w:rPr>
-        <w:t>Their MTB ratio is also higher, with a median of 1.26 against 0.95, while leverage differs little (normalized difference: −0.04).</w:t>
+        <w:t xml:space="preserve">Table 1 compares scored firms in the base year with never-scored firm-years in the sample. </w:t>
+      </w:r>
+      <w:r>
+        <w:rPr>
+          <w:color w:val="0000FF"/>
+        </w:rPr>
+        <w:t>Scored firms are larger: their median market capitalization is 203.2 million U.S. dollars against 42.2 million, and their median total assets are 4.3 times as large.</w:t>
+      </w:r>
+      <w:r>
+        <w:rPr/>
+        <w:t xml:space="preserve"> </w:t>
+      </w:r>
+      <w:r>
+        <w:rPr>
+          <w:color w:val="0000FF"/>
+        </w:rPr>
+        <w:t>Their MTB ratio is also higher, while leverage differs little.</w:t>
       </w:r>
       <w:r>
         <w:rPr/>
@@ -8708,24 +8718,10 @@
         <w:jc w:val="both"/>
       </w:pPr>
       <w:r>
-        <w:rPr/>
-        <w:t>Figure 2 separates the two largest coverage waves from the remaining cohorts</w:t>
-      </w:r>
-      <w:r>
-        <w:rPr>
-          <w:color w:val="0000FF"/>
-        </w:rPr>
-        <w:t>; because we drew the wave boundaries after seeing the coverage counts, this split is exploratory</w:t>
-      </w:r>
-      <w:r>
-        <w:rPr/>
-        <w:t xml:space="preserve">. </w:t>
-      </w:r>
-      <w:r>
-        <w:rPr>
-          <w:color w:val="0000FF"/>
-        </w:rPr>
-        <w:t>The 108 Thai and Singaporean firms first scored in 2019 and 2020 show the largest run-up: from event year −5 to the base year, their MTB ratio grew 33.1% more than that of never-scored firms (pre-trend p = 0.006).</w:t>
+        <w:rPr>
+          <w:color w:val="0000FF"/>
+        </w:rPr>
+        <w:t>Figure 2 separates the two largest coverage waves from the remaining cohorts; because we drew the wave boundaries after seeing the coverage counts, this split is exploratory.</w:t>
       </w:r>
       <w:r>
         <w:rPr/>
@@ -8735,7 +8731,7 @@
         <w:rPr>
           <w:color w:val="0000FF"/>
         </w:rPr>
-        <w:t>The 289 Malaysian firms first scored in 2021 and 2022 show no run-up: their pre-coverage MTB estimates range from −0.027 to 0.041 (pre-trend p = 0.549).</w:t>
+        <w:t>The 108 Thai and Singaporean firms first scored in 2019 and 2020 show the largest run-up: from event year −5 to the base year, their MTB ratio grew 33.1% more than that of never-scored firms (pre-trend p = 0.006).</w:t>
       </w:r>
       <w:r>
         <w:rPr/>
@@ -8745,21 +8741,17 @@
         <w:rPr>
           <w:color w:val="0000FF"/>
         </w:rPr>
-        <w:t>The 278 firms in the remaining cohorts fall in between (pre-trend p = 0.006).</w:t>
+        <w:t>The 289 Malaysian firms first scored in 2021 and 2022 show no run-up (pre-trend p = 0.549), and the 278 firms in the remaining cohorts fall in between.</w:t>
       </w:r>
       <w:r>
         <w:rPr/>
-        <w:t xml:space="preserve"> After the first </w:t>
-      </w:r>
-      <w:r>
-        <w:rPr>
-          <w:color w:val="0000FF"/>
-        </w:rPr>
-        <w:t>recorded</w:t>
-      </w:r>
-      <w:r>
-        <w:rPr/>
-        <w:t xml:space="preserve"> score, no group shows an MTB gain: the estimates of Eq. (6) are 0.021 for the Malaysian wave, −0.009 for the Thai and Singaporean wave, and −0.016 for the remaining cohorts. Market capitalization fell after coverage in the Malaysian wave (−0.146, p = 0.005), which accounts for the negative pooled estimate.</w:t>
+        <w:t xml:space="preserve"> </w:t>
+      </w:r>
+      <w:r>
+        <w:rPr>
+          <w:color w:val="0000FF"/>
+        </w:rPr>
+        <w:t>After the first recorded score, no wave shows an MTB gain (Table S10), while market capitalization fell in the Malaysian wave (−0.146, p = 0.005), which accounts for the negative pooled market capitalization estimate.</w:t>
       </w:r>
     </w:p>
     <w:p>
@@ -8797,17 +8789,37 @@
       </w:pPr>
       <w:r>
         <w:rPr/>
-        <w:t xml:space="preserve">Table 2 reports the headline estimates of Eq. (6). The </w:t>
-      </w:r>
-      <w:r>
-        <w:rPr>
-          <w:color w:val="0000FF"/>
-        </w:rPr>
-        <w:t>change in</w:t>
+        <w:t xml:space="preserve">Table 2 reports the headline estimates of Eq. (6). </w:t>
+      </w:r>
+      <w:r>
+        <w:rPr>
+          <w:color w:val="0000FF"/>
+        </w:rPr>
+        <w:t>The change in log MTB is 0.002, with a 95% confidence interval of −0.046 to 0.048.</w:t>
       </w:r>
       <w:r>
         <w:rPr/>
-        <w:t xml:space="preserve"> log MTB is 0.002, with a standard error of 0.024 and a 95% confidence interval of −0.046 to 0.048. Under assumption (2), the data are compatible with changes in the MTB ratio from −4.5% to 4.9%, so increases of a few percent remain possible. The MDE from Eq. (7) is 0.067, about 7.0%. With the cluster bootstrap, the interval is −0.050 to 0.053.</w:t>
+        <w:t xml:space="preserve"> </w:t>
+      </w:r>
+      <w:r>
+        <w:rPr>
+          <w:color w:val="0000FF"/>
+        </w:rPr>
+        <w:t>Under assumption (2), the data are compatible with changes in the MTB ratio from −4.5% to 4.9%, so increases of a few percent remain possible; the MDE from Eq.</w:t>
+      </w:r>
+      <w:r>
+        <w:rPr/>
+        <w:t xml:space="preserve"> </w:t>
+      </w:r>
+      <w:r>
+        <w:rPr>
+          <w:color w:val="0000FF"/>
+        </w:rPr>
+        <w:t>(7) is about 7.0%.</w:t>
+      </w:r>
+      <w:r>
+        <w:rPr/>
+        <w:t xml:space="preserve"> With the cluster bootstrap, the interval is −0.050 to 0.053.</w:t>
       </w:r>
     </w:p>
     <w:p>
@@ -10095,13 +10107,7 @@
         <w:rPr>
           <w:color w:val="0000FF"/>
         </w:rPr>
-        <w:t xml:space="preserve">Row R11 keeps the 7 cohorts observed through event year 3 and gives −0.008 (p = 0.806), so changing cohort composition does not explain the headline estimate. </w:t>
-      </w:r>
-      <w:r>
-        <w:rPr>
-          <w:color w:val="0000FF"/>
-        </w:rPr>
-        <w:t>Removing a linear pre-trend with Eq.</w:t>
+        <w:t>Row R11 keeps the 7 cohorts observed through event year 3 and gives −0.008 (p = 0.806), so changing cohort composition does not explain the headline estimate.</w:t>
       </w:r>
       <w:r>
         <w:rPr/>
@@ -10111,11 +10117,17 @@
         <w:rPr>
           <w:color w:val="0000FF"/>
         </w:rPr>
-        <w:t>(9) (row R7) gives −0.052 (95% interval −0.118 to 0.014), and matching on pre-coverage growth (row R8) gives 0.028 (95% interval −0.021 to 0.077);</w:t>
+        <w:t>Removing a linear pre-trend with Eq.</w:t>
       </w:r>
       <w:r>
         <w:rPr/>
-        <w:t xml:space="preserve"> Appendix A.11 of the supplementary material discusses both.</w:t>
+        <w:t xml:space="preserve"> </w:t>
+      </w:r>
+      <w:r>
+        <w:rPr>
+          <w:color w:val="0000FF"/>
+        </w:rPr>
+        <w:t>(9) (row R7) gives −0.052, and matching on pre-coverage growth (row R8) gives 0.028; both intervals include zero, and Appendix A.11 of the supplementary material discusses them.</w:t>
       </w:r>
     </w:p>
     <w:p>
@@ -10126,13 +10138,33 @@
       </w:pPr>
       <w:r>
         <w:rPr/>
-        <w:t xml:space="preserve">Table S5 reports the bounds of Eq. (10). With M̄ = 0.25, the interval for the MTB effect is −0.071 to 0.073; with M̄ = 1, it widens to −0.147 to 0.148. Any departure with M̄ above about 0.01 admits an increase of 5%, and any departure at all admits a positive effect. </w:t>
-      </w:r>
-      <w:r>
-        <w:rPr>
-          <w:color w:val="0000FF"/>
-        </w:rPr>
-        <w:t>Under the one-year-later dating, the decline loses significance with M̄ = 0.25, when its interval runs from −0.138 to 0.002. Modest departures from parallel trends, smaller than those observed before coverage, are therefore enough to change the reading of either dating.</w:t>
+        <w:t xml:space="preserve">Table S5 reports the bounds of Eq. (10). </w:t>
+      </w:r>
+      <w:r>
+        <w:rPr>
+          <w:color w:val="0000FF"/>
+        </w:rPr>
+        <w:t>With M̄ = 0.25, the interval for the MTB effect is −0.071 to 0.073, and any departure at all admits a positive effect.</w:t>
+      </w:r>
+      <w:r>
+        <w:rPr/>
+        <w:t xml:space="preserve"> </w:t>
+      </w:r>
+      <w:r>
+        <w:rPr>
+          <w:color w:val="0000FF"/>
+        </w:rPr>
+        <w:t>Under the one-year-later dating, the decline loses significance with M̄ = 0.25, when its interval runs from −0.138 to 0.002.</w:t>
+      </w:r>
+      <w:r>
+        <w:rPr/>
+        <w:t xml:space="preserve"> </w:t>
+      </w:r>
+      <w:r>
+        <w:rPr>
+          <w:color w:val="0000FF"/>
+        </w:rPr>
+        <w:t>Modest departures from parallel trends, smaller than those observed before coverage, are therefore enough to change the reading of either dating.</w:t>
       </w:r>
     </w:p>
     <w:p>
@@ -11306,7 +11338,7 @@
           <w:color w:val="0000FF"/>
           <w:sz w:val="18"/>
         </w:rPr>
-        <w:t>Note: Effects over event years 0 to 3, bootstrap standard errors in parentheses; percentile rows cap scored firms' base-year assets at that control percentile. *, **, ***: 10%, 5%, 1% significance.</w:t>
+        <w:t>Note: Bootstrap standard errors in parentheses; percentile rows cap scored firms' base-year assets at that control percentile. *, **, ***: 10%, 5%, 1% significance.</w:t>
       </w:r>
     </w:p>
     <w:p>
@@ -13446,7 +13478,7 @@
           <w:color w:val="0000FF"/>
           <w:sz w:val="18"/>
         </w:rPr>
-        <w:t>Note: Effects over event years 0 to 3, bootstrap standard errors in parentheses; flags mark implied book equity above ten times assets (Section 3.4). *, **, ***: 10%, 5%, 1% significance.</w:t>
+        <w:t>Note: Bootstrap standard errors in parentheses; flags mark implied book equity above ten times assets (Section 3.4). *, **, ***: 10%, 5%, 1% significance.</w:t>
       </w:r>
     </w:p>
     <w:p>
@@ -14207,7 +14239,7 @@
       </w:r>
       <w:r>
         <w:rPr/>
-        <w:t xml:space="preserve"> Whether coverage itself changed valuations cannot be settled with these data: the answer moves from no detected change to a decline of 6.6% depending on when investors are assumed to have seen the score, the decline appears only where valuations had run up, and modest departures from parallel trends change either reading.</w:t>
+        <w:t xml:space="preserve"> Whether coverage itself changed valuations cannot be settled with these data: the answer moves from no detected change (95% interval −0.046 to 0.048 in log MTB) to a decline of 6.6% depending on when investors are assumed to have seen the score, the decline appears only where valuations had run up, and modest departures from parallel trends change either reading.</w:t>
       </w:r>
     </w:p>
     <w:p>

</xml_diff>

<commit_message>
SAJE revision: PDF review copies; heading numbering fix
Co-Authored-By: Claude Opus 5.5 <noreply@anthropic.com>
Claude-Session: https://claude.ai/code/session_01Ny4MKFPCnQG8RbtvfHQ86Z
</commit_message>
<xml_diff>
--- a/SAJE_292892_revision/build_r2/02_Manuscript_Revised_Marked_blue.docx
+++ b/SAJE_292892_revision/build_r2/02_Manuscript_Revised_Marked_blue.docx
@@ -1383,27 +1383,7 @@
           <w:color w:val="0000FF"/>
           <w:sz w:val="24"/>
         </w:rPr>
-        <w:t>3.4.</w:t>
-      </w:r>
-      <w:r>
-        <w:rPr>
-          <w:rFonts w:ascii="Times New Roman" w:hAnsi="Times New Roman" w:eastAsia="Times New Roman"/>
-          <w:b/>
-          <w:i w:val="0"/>
-          <w:color w:val="000000"/>
-          <w:sz w:val="24"/>
-        </w:rPr>
-        <w:t xml:space="preserve"> Outcomes </w:t>
-      </w:r>
-      <w:r>
-        <w:rPr>
-          <w:rFonts w:ascii="Times New Roman" w:hAnsi="Times New Roman" w:eastAsia="Times New Roman"/>
-          <w:b/>
-          <w:i w:val="0"/>
-          <w:color w:val="0000FF"/>
-          <w:sz w:val="24"/>
-        </w:rPr>
-        <w:t>and recording errors</w:t>
+        <w:t>3.4 Outcomes and recording errors</w:t>
       </w:r>
     </w:p>
     <w:p>
@@ -13604,37 +13584,7 @@
           <w:color w:val="0000FF"/>
           <w:sz w:val="24"/>
         </w:rPr>
-        <w:t>5.9.</w:t>
-      </w:r>
-      <w:r>
-        <w:rPr>
-          <w:rFonts w:ascii="Times New Roman" w:hAnsi="Times New Roman" w:eastAsia="Times New Roman"/>
-          <w:b/>
-          <w:i w:val="0"/>
-          <w:color w:val="000000"/>
-          <w:sz w:val="24"/>
-        </w:rPr>
-        <w:t xml:space="preserve"> Does the </w:t>
-      </w:r>
-      <w:r>
-        <w:rPr>
-          <w:rFonts w:ascii="Times New Roman" w:hAnsi="Times New Roman" w:eastAsia="Times New Roman"/>
-          <w:b/>
-          <w:i w:val="0"/>
-          <w:color w:val="0000FF"/>
-          <w:sz w:val="24"/>
-        </w:rPr>
-        <w:t>initial</w:t>
-      </w:r>
-      <w:r>
-        <w:rPr>
-          <w:rFonts w:ascii="Times New Roman" w:hAnsi="Times New Roman" w:eastAsia="Times New Roman"/>
-          <w:b/>
-          <w:i w:val="0"/>
-          <w:color w:val="000000"/>
-          <w:sz w:val="24"/>
-        </w:rPr>
-        <w:t xml:space="preserve"> score matter?</w:t>
+        <w:t>5.9 Does the initial score matter?</w:t>
       </w:r>
     </w:p>
     <w:p>
@@ -14020,17 +13970,7 @@
           <w:color w:val="0000FF"/>
           <w:sz w:val="24"/>
         </w:rPr>
-        <w:t>6.4.</w:t>
-      </w:r>
-      <w:r>
-        <w:rPr>
-          <w:rFonts w:ascii="Times New Roman" w:hAnsi="Times New Roman" w:eastAsia="Times New Roman"/>
-          <w:b/>
-          <w:i w:val="0"/>
-          <w:color w:val="000000"/>
-          <w:sz w:val="24"/>
-        </w:rPr>
-        <w:t xml:space="preserve"> Implications</w:t>
+        <w:t>6.4 Implications</w:t>
       </w:r>
     </w:p>
     <w:p>

</xml_diff>

<commit_message>
Round-2 build: italic-span fix in builder, NA-coefficient check, notes, letter quote, Table 4 label
Co-Authored-By: Claude Opus 5.5 <noreply@anthropic.com>
Claude-Session: https://claude.ai/code/session_01Ny4MKFPCnQG8RbtvfHQ86Z
</commit_message>
<xml_diff>
--- a/SAJE_292892_revision/build_r2/02_Manuscript_Revised_Marked_blue.docx
+++ b/SAJE_292892_revision/build_r2/02_Manuscript_Revised_Marked_blue.docx
@@ -74,7 +74,7 @@
         <w:rPr>
           <w:color w:val="0000FF"/>
         </w:rPr>
-        <w:t>Scored firms are larger, and on average their market-to-book ratio had grown 10.0% faster than that of similar firms before the first recorded score, a run-up absent in a broad Malaysian wave.</w:t>
+        <w:t>Scored firms are larger, and on average their market-to-book ratio had grown 10.0% faster than that of similar firms before the first recorded score, a run-up not detected in a broad Malaysian wave.</w:t>
       </w:r>
       <w:r>
         <w:rPr/>
@@ -244,8 +244,14 @@
         <w:jc w:val="both"/>
       </w:pPr>
       <w:r>
+        <w:rPr>
+          <w:color w:val="0000FF"/>
+        </w:rPr>
+        <w:t>Studies, mostly of U.S. firms, link coverage by more raters to fewer ESG violations (Tsang et al., 2024), lower emissions and more ownership by high-ESG institutions (Bikmetova &amp; Pirinsky, 2026), and dividend increases (Tsang et al., 2025).</w:t>
+      </w:r>
+      <w:r>
         <w:rPr/>
-        <w:t>U.S. studies link coverage by more raters to fewer ESG violations (Tsang et al., 2024), lower emissions and more ownership by high-ESG institutions (Bikmetova &amp; Pirinsky, 2026), and dividend increases (Tsang et al., 2025). None examines valuation in emerging markets, where most firms are unscored and coverage has expanded in waves.</w:t>
+        <w:t xml:space="preserve"> None examines valuation in emerging markets, where most firms are unscored and coverage has expanded in waves.</w:t>
       </w:r>
     </w:p>
     <w:p>
@@ -256,17 +262,27 @@
       </w:pPr>
       <w:r>
         <w:rPr/>
-        <w:t xml:space="preserve">We study Indonesia, Malaysia, the Philippines, Singapore, and Thailand. </w:t>
-      </w:r>
-      <w:r>
-        <w:rPr>
-          <w:color w:val="0000FF"/>
-        </w:rPr>
-        <w:t>Of the 675 non-financial firms that entered LSEG coverage between 2015 and 2024, 577 did so in 2020 to 2023, and 289 were Malaysian firms first scored in 2021 or 2022.</w:t>
+        <w:t xml:space="preserve">We study Indonesia, Malaysia, the Philippines, Singapore, and Thailand. Of the 675 non-financial firms </w:t>
+      </w:r>
+      <w:r>
+        <w:rPr>
+          <w:color w:val="0000FF"/>
+        </w:rPr>
+        <w:t>whose first recorded LSEG score falls</w:t>
       </w:r>
       <w:r>
         <w:rPr/>
-        <w:t xml:space="preserve"> We compare these firms with 2,613 never-scored firms before and after each firm's </w:t>
+        <w:t xml:space="preserve"> between 2015 and 2024, 577 </w:t>
+      </w:r>
+      <w:r>
+        <w:rPr>
+          <w:color w:val="0000FF"/>
+        </w:rPr>
+        <w:t>had it</w:t>
+      </w:r>
+      <w:r>
+        <w:rPr/>
+        <w:t xml:space="preserve"> in 2020 to 2023, and 289 were Malaysian firms first scored in 2021 or 2022. We compare these firms with 2,613 never-scored firms before and after each firm's </w:t>
       </w:r>
       <w:r>
         <w:rPr>
@@ -329,7 +345,7 @@
         <w:rPr>
           <w:color w:val="0000FF"/>
         </w:rPr>
-        <w:t>The run-up is large in the 108 Thai and Singaporean firms first scored in 2019 and 2020 and absent in the 289 Malaysian firms first scored in 2021 and 2022, the largest wave in the data (Figure 2).</w:t>
+        <w:t>The run-up is large in the 108 Thai and Singaporean firms first scored in 2019 and 2020 and not detected in the 289 Malaysian firms first scored in 2021 and 2022, the largest wave in the data (Figure 2).</w:t>
       </w:r>
     </w:p>
     <w:p>
@@ -342,7 +358,20 @@
         <w:rPr>
           <w:sz w:val="22"/>
         </w:rPr>
-        <w:t xml:space="preserve">Figure 1. Event-time effects of the first </w:t>
+        <w:t xml:space="preserve">Figure 1. Event-time </w:t>
+      </w:r>
+      <w:r>
+        <w:rPr>
+          <w:color w:val="0000FF"/>
+          <w:sz w:val="22"/>
+        </w:rPr>
+        <w:t>changes around</w:t>
+      </w:r>
+      <w:r>
+        <w:rPr>
+          <w:sz w:val="22"/>
+        </w:rPr>
+        <w:t xml:space="preserve"> the first </w:t>
       </w:r>
       <w:r>
         <w:rPr>
@@ -366,7 +395,7 @@
       <w:r>
         <w:drawing>
           <wp:inline xmlns:a="http://schemas.openxmlformats.org/drawingml/2006/main" xmlns:pic="http://schemas.openxmlformats.org/drawingml/2006/picture">
-            <wp:extent cx="5943600" cy="4572000"/>
+            <wp:extent cx="5943600" cy="4754880"/>
             <wp:docPr id="1" name="Picture 1"/>
             <wp:cNvGraphicFramePr>
               <a:graphicFrameLocks noChangeAspect="1"/>
@@ -387,7 +416,7 @@
                   <pic:spPr>
                     <a:xfrm>
                       <a:off x="0" y="0"/>
-                      <a:ext cx="5943600" cy="4572000"/>
+                      <a:ext cx="5943600" cy="4754880"/>
                     </a:xfrm>
                     <a:prstGeom prst="rect"/>
                   </pic:spPr>
@@ -421,7 +450,7 @@
           <w:color w:val="0000FF"/>
           <w:sz w:val="18"/>
         </w:rPr>
-        <w:t>(5) relative to event year −1, with bootstrap 95% intervals; open markers are pre-coverage years.</w:t>
+        <w:t>(5) relative to event year −1, with firm-bootstrap 95% intervals; open markers are pre-coverage years.</w:t>
       </w:r>
       <w:r>
         <w:rPr>
@@ -482,7 +511,7 @@
       <w:r>
         <w:drawing>
           <wp:inline xmlns:a="http://schemas.openxmlformats.org/drawingml/2006/main" xmlns:pic="http://schemas.openxmlformats.org/drawingml/2006/picture">
-            <wp:extent cx="5943600" cy="5486400"/>
+            <wp:extent cx="5943600" cy="5120640"/>
             <wp:docPr id="2" name="Picture 2"/>
             <wp:cNvGraphicFramePr>
               <a:graphicFrameLocks noChangeAspect="1"/>
@@ -503,7 +532,7 @@
                   <pic:spPr>
                     <a:xfrm>
                       <a:off x="0" y="0"/>
-                      <a:ext cx="5943600" cy="5486400"/>
+                      <a:ext cx="5943600" cy="5120640"/>
                     </a:xfrm>
                     <a:prstGeom prst="rect"/>
                   </pic:spPr>
@@ -537,7 +566,7 @@
           <w:color w:val="0000FF"/>
           <w:sz w:val="18"/>
         </w:rPr>
-        <w:t>(5) by wave against all never-scored firms, with bootstrap 95% intervals.</w:t>
+        <w:t>(5) by wave against all never-scored firms, with firm-bootstrap 95% intervals.</w:t>
       </w:r>
       <w:r>
         <w:rPr>
@@ -633,7 +662,7 @@
         <w:rPr>
           <w:color w:val="0000FF"/>
         </w:rPr>
-        <w:t>Tsang et al., 2024, 2025): outside its largest wave, one provider scored firms that had just outgrown their peers.</w:t>
+        <w:t>Tsang et al., 2024, 2025): one provider scored firms that had outgrown their peers, most clearly outside its largest wave.</w:t>
       </w:r>
       <w:r>
         <w:rPr/>
@@ -1433,7 +1462,7 @@
         <w:rPr>
           <w:color w:val="0000FF"/>
         </w:rPr>
-        <w:t>Ratios slightly above one can arise when the two are measured on different dates, so we flag firm-years in which the implied book equity exceeds ten times total assets, an error of an order of magnitude.</w:t>
+        <w:t>Of the 27,127 firm-years with all three items, 1,030 have ratios between one and two, which can arise when the items are measured on different dates, and 540 have ratios between two and ten.</w:t>
       </w:r>
       <w:r>
         <w:rPr/>
@@ -1443,7 +1472,27 @@
         <w:rPr>
           <w:color w:val="0000FF"/>
         </w:rPr>
-        <w:t>The rule flags 209 of 27,127 firm-years (0.77%), 73 of them for scored firms.</w:t>
+        <w:t>Our main rule flags firm-years in which the implied book equity exceeds ten times total assets, an error of an order of magnitude:</w:t>
+      </w:r>
+      <w:r>
+        <w:rPr/>
+        <w:t xml:space="preserve"> </w:t>
+      </w:r>
+      <w:r>
+        <w:rPr>
+          <w:color w:val="0000FF"/>
+        </w:rPr>
+        <w:t>209 firm-years (0.77%), 73 of them for scored firms.</w:t>
+      </w:r>
+      <w:r>
+        <w:rPr/>
+        <w:t xml:space="preserve"> </w:t>
+      </w:r>
+      <w:r>
+        <w:rPr>
+          <w:color w:val="0000FF"/>
+        </w:rPr>
+        <w:t>A stricter rule, a ratio above two, flags 749 firm-years.</w:t>
       </w:r>
       <w:r>
         <w:rPr/>
@@ -3466,11 +3515,11 @@
         <w:rPr>
           <w:color w:val="0000FF"/>
         </w:rPr>
-        <w:t>Section 5.6 therefore restricts scored firms to the size range of the controls, where the doubly robust estimator becomes usable (Crump et al., 2009;</w:t>
+        <w:t>Section 5.6 therefore restricts scored firms to the size range of the controls, in the spirit of the overlap trimming of Crump et al.</w:t>
       </w:r>
       <w:r>
         <w:rPr/>
-        <w:t xml:space="preserve"> Sant'Anna &amp; Zhao, 2020).</w:t>
+        <w:t xml:space="preserve"> (2009), where the doubly robust estimator becomes usable (Sant'Anna &amp; Zhao, 2020).</w:t>
       </w:r>
       <w:r>
         <w:rPr/>
@@ -5729,7 +5778,7 @@
           <w:color w:val="0000FF"/>
           <w:sz w:val="18"/>
         </w:rPr>
-        <w:t>(6) with bootstrap standard errors and unadjusted 95% confidence intervals (CI); secondary p-values are Holm-adjusted.</w:t>
+        <w:t>(6), firm-bootstrap standard errors, unadjusted 95% CI; secondary p-values Holm-adjusted; firm counts cover all event-time cells.</w:t>
       </w:r>
       <w:r>
         <w:rPr>
@@ -6789,11 +6838,12 @@
         <w:tblLook w:firstColumn="1" w:firstRow="1" w:lastColumn="0" w:lastRow="0" w:noHBand="0" w:noVBand="1" w:val="04A0"/>
       </w:tblPr>
       <w:tblGrid>
-        <w:gridCol w:w="2736"/>
-        <w:gridCol w:w="1655"/>
-        <w:gridCol w:w="1655"/>
-        <w:gridCol w:w="1655"/>
-        <w:gridCol w:w="1655"/>
+        <w:gridCol w:w="2448"/>
+        <w:gridCol w:w="1368"/>
+        <w:gridCol w:w="1368"/>
+        <w:gridCol w:w="1368"/>
+        <w:gridCol w:w="1368"/>
+        <w:gridCol w:w="1440"/>
       </w:tblGrid>
       <w:tr>
         <w:trPr>
@@ -6802,7 +6852,7 @@
         </w:trPr>
         <w:tc>
           <w:tcPr>
-            <w:tcW w:type="dxa" w:w="2736"/>
+            <w:tcW w:type="dxa" w:w="2448"/>
             <w:tcBorders>
               <w:top w:val="single" w:sz="6" w:color="000000"/>
               <w:bottom w:val="single" w:sz="6" w:color="000000"/>
@@ -6825,7 +6875,7 @@
         </w:tc>
         <w:tc>
           <w:tcPr>
-            <w:tcW w:type="dxa" w:w="1656"/>
+            <w:tcW w:type="dxa" w:w="1368"/>
             <w:tcBorders>
               <w:top w:val="single" w:sz="6" w:color="000000"/>
               <w:bottom w:val="single" w:sz="6" w:color="000000"/>
@@ -6849,7 +6899,7 @@
         </w:tc>
         <w:tc>
           <w:tcPr>
-            <w:tcW w:type="dxa" w:w="1656"/>
+            <w:tcW w:type="dxa" w:w="1368"/>
             <w:tcBorders>
               <w:top w:val="single" w:sz="6" w:color="000000"/>
               <w:bottom w:val="single" w:sz="6" w:color="000000"/>
@@ -6873,7 +6923,7 @@
         </w:tc>
         <w:tc>
           <w:tcPr>
-            <w:tcW w:type="dxa" w:w="1656"/>
+            <w:tcW w:type="dxa" w:w="1368"/>
             <w:tcBorders>
               <w:top w:val="single" w:sz="6" w:color="000000"/>
               <w:bottom w:val="single" w:sz="6" w:color="000000"/>
@@ -6897,7 +6947,7 @@
         </w:tc>
         <w:tc>
           <w:tcPr>
-            <w:tcW w:type="dxa" w:w="1656"/>
+            <w:tcW w:type="dxa" w:w="1368"/>
             <w:tcBorders>
               <w:top w:val="single" w:sz="6" w:color="000000"/>
               <w:bottom w:val="single" w:sz="6" w:color="000000"/>
@@ -6919,6 +6969,30 @@
             </w:r>
           </w:p>
         </w:tc>
+        <w:tc>
+          <w:tcPr>
+            <w:tcW w:type="dxa" w:w="1440"/>
+            <w:tcBorders>
+              <w:top w:val="single" w:sz="6" w:color="000000"/>
+              <w:bottom w:val="single" w:sz="6" w:color="000000"/>
+            </w:tcBorders>
+          </w:tcPr>
+          <w:p>
+            <w:pPr>
+              <w:keepNext/>
+              <w:spacing w:after="0" w:line="240" w:lineRule="auto"/>
+              <w:jc w:val="center"/>
+            </w:pPr>
+            <w:r/>
+            <w:r>
+              <w:rPr>
+                <w:b/>
+                <w:sz w:val="18"/>
+              </w:rPr>
+              <w:t>Scored / control firms</w:t>
+            </w:r>
+          </w:p>
+        </w:tc>
       </w:tr>
       <w:tr>
         <w:trPr>
@@ -6926,7 +7000,7 @@
         </w:trPr>
         <w:tc>
           <w:tcPr>
-            <w:tcW w:type="dxa" w:w="2736"/>
+            <w:tcW w:type="dxa" w:w="2448"/>
           </w:tcPr>
           <w:p>
             <w:pPr>
@@ -6944,7 +7018,7 @@
         </w:tc>
         <w:tc>
           <w:tcPr>
-            <w:tcW w:type="dxa" w:w="1656"/>
+            <w:tcW w:type="dxa" w:w="1368"/>
           </w:tcPr>
           <w:p>
             <w:pPr>
@@ -6963,7 +7037,7 @@
         </w:tc>
         <w:tc>
           <w:tcPr>
-            <w:tcW w:type="dxa" w:w="1656"/>
+            <w:tcW w:type="dxa" w:w="1368"/>
           </w:tcPr>
           <w:p>
             <w:pPr>
@@ -6982,7 +7056,7 @@
         </w:tc>
         <w:tc>
           <w:tcPr>
-            <w:tcW w:type="dxa" w:w="1656"/>
+            <w:tcW w:type="dxa" w:w="1368"/>
           </w:tcPr>
           <w:p>
             <w:pPr>
@@ -7001,7 +7075,7 @@
         </w:tc>
         <w:tc>
           <w:tcPr>
-            <w:tcW w:type="dxa" w:w="1656"/>
+            <w:tcW w:type="dxa" w:w="1368"/>
           </w:tcPr>
           <w:p>
             <w:pPr>
@@ -7018,6 +7092,25 @@
             </w:r>
           </w:p>
         </w:tc>
+        <w:tc>
+          <w:tcPr>
+            <w:tcW w:type="dxa" w:w="1440"/>
+          </w:tcPr>
+          <w:p>
+            <w:pPr>
+              <w:keepNext/>
+              <w:spacing w:after="0" w:line="240" w:lineRule="auto"/>
+              <w:jc w:val="center"/>
+            </w:pPr>
+            <w:r/>
+            <w:r>
+              <w:rPr>
+                <w:sz w:val="18"/>
+              </w:rPr>
+              <w:t>628 / 2,412</w:t>
+            </w:r>
+          </w:p>
+        </w:tc>
       </w:tr>
       <w:tr>
         <w:trPr>
@@ -7025,7 +7118,7 @@
         </w:trPr>
         <w:tc>
           <w:tcPr>
-            <w:tcW w:type="dxa" w:w="2736"/>
+            <w:tcW w:type="dxa" w:w="2448"/>
           </w:tcPr>
           <w:p>
             <w:pPr>
@@ -7043,7 +7136,7 @@
         </w:tc>
         <w:tc>
           <w:tcPr>
-            <w:tcW w:type="dxa" w:w="1656"/>
+            <w:tcW w:type="dxa" w:w="1368"/>
           </w:tcPr>
           <w:p>
             <w:pPr>
@@ -7062,7 +7155,7 @@
         </w:tc>
         <w:tc>
           <w:tcPr>
-            <w:tcW w:type="dxa" w:w="1656"/>
+            <w:tcW w:type="dxa" w:w="1368"/>
           </w:tcPr>
           <w:p>
             <w:pPr>
@@ -7081,7 +7174,7 @@
         </w:tc>
         <w:tc>
           <w:tcPr>
-            <w:tcW w:type="dxa" w:w="1656"/>
+            <w:tcW w:type="dxa" w:w="1368"/>
           </w:tcPr>
           <w:p>
             <w:pPr>
@@ -7100,7 +7193,7 @@
         </w:tc>
         <w:tc>
           <w:tcPr>
-            <w:tcW w:type="dxa" w:w="1656"/>
+            <w:tcW w:type="dxa" w:w="1368"/>
           </w:tcPr>
           <w:p>
             <w:pPr>
@@ -7117,6 +7210,25 @@
             </w:r>
           </w:p>
         </w:tc>
+        <w:tc>
+          <w:tcPr>
+            <w:tcW w:type="dxa" w:w="1440"/>
+          </w:tcPr>
+          <w:p>
+            <w:pPr>
+              <w:keepNext/>
+              <w:spacing w:after="0" w:line="240" w:lineRule="auto"/>
+              <w:jc w:val="center"/>
+            </w:pPr>
+            <w:r/>
+            <w:r>
+              <w:rPr>
+                <w:sz w:val="18"/>
+              </w:rPr>
+              <w:t>628 / 3,023</w:t>
+            </w:r>
+          </w:p>
+        </w:tc>
       </w:tr>
       <w:tr>
         <w:trPr>
@@ -7124,7 +7236,7 @@
         </w:trPr>
         <w:tc>
           <w:tcPr>
-            <w:tcW w:type="dxa" w:w="2736"/>
+            <w:tcW w:type="dxa" w:w="2448"/>
           </w:tcPr>
           <w:p>
             <w:pPr>
@@ -7142,7 +7254,7 @@
         </w:tc>
         <w:tc>
           <w:tcPr>
-            <w:tcW w:type="dxa" w:w="1656"/>
+            <w:tcW w:type="dxa" w:w="1368"/>
           </w:tcPr>
           <w:p>
             <w:pPr>
@@ -7161,7 +7273,7 @@
         </w:tc>
         <w:tc>
           <w:tcPr>
-            <w:tcW w:type="dxa" w:w="1656"/>
+            <w:tcW w:type="dxa" w:w="1368"/>
           </w:tcPr>
           <w:p>
             <w:pPr>
@@ -7180,7 +7292,7 @@
         </w:tc>
         <w:tc>
           <w:tcPr>
-            <w:tcW w:type="dxa" w:w="1656"/>
+            <w:tcW w:type="dxa" w:w="1368"/>
           </w:tcPr>
           <w:p>
             <w:pPr>
@@ -7199,7 +7311,7 @@
         </w:tc>
         <w:tc>
           <w:tcPr>
-            <w:tcW w:type="dxa" w:w="1656"/>
+            <w:tcW w:type="dxa" w:w="1368"/>
           </w:tcPr>
           <w:p>
             <w:pPr>
@@ -7216,6 +7328,25 @@
             </w:r>
           </w:p>
         </w:tc>
+        <w:tc>
+          <w:tcPr>
+            <w:tcW w:type="dxa" w:w="1440"/>
+          </w:tcPr>
+          <w:p>
+            <w:pPr>
+              <w:keepNext/>
+              <w:spacing w:after="0" w:line="240" w:lineRule="auto"/>
+              <w:jc w:val="center"/>
+            </w:pPr>
+            <w:r/>
+            <w:r>
+              <w:rPr>
+                <w:sz w:val="18"/>
+              </w:rPr>
+              <w:t>628 / 2,412</w:t>
+            </w:r>
+          </w:p>
+        </w:tc>
       </w:tr>
       <w:tr>
         <w:trPr>
@@ -7223,7 +7354,7 @@
         </w:trPr>
         <w:tc>
           <w:tcPr>
-            <w:tcW w:type="dxa" w:w="2736"/>
+            <w:tcW w:type="dxa" w:w="2448"/>
           </w:tcPr>
           <w:p>
             <w:pPr>
@@ -7241,7 +7372,7 @@
         </w:tc>
         <w:tc>
           <w:tcPr>
-            <w:tcW w:type="dxa" w:w="1656"/>
+            <w:tcW w:type="dxa" w:w="1368"/>
           </w:tcPr>
           <w:p>
             <w:pPr>
@@ -7260,7 +7391,7 @@
         </w:tc>
         <w:tc>
           <w:tcPr>
-            <w:tcW w:type="dxa" w:w="1656"/>
+            <w:tcW w:type="dxa" w:w="1368"/>
           </w:tcPr>
           <w:p>
             <w:pPr>
@@ -7279,7 +7410,7 @@
         </w:tc>
         <w:tc>
           <w:tcPr>
-            <w:tcW w:type="dxa" w:w="1656"/>
+            <w:tcW w:type="dxa" w:w="1368"/>
           </w:tcPr>
           <w:p>
             <w:pPr>
@@ -7298,7 +7429,7 @@
         </w:tc>
         <w:tc>
           <w:tcPr>
-            <w:tcW w:type="dxa" w:w="1656"/>
+            <w:tcW w:type="dxa" w:w="1368"/>
           </w:tcPr>
           <w:p>
             <w:pPr>
@@ -7315,6 +7446,25 @@
             </w:r>
           </w:p>
         </w:tc>
+        <w:tc>
+          <w:tcPr>
+            <w:tcW w:type="dxa" w:w="1440"/>
+          </w:tcPr>
+          <w:p>
+            <w:pPr>
+              <w:keepNext/>
+              <w:spacing w:after="0" w:line="240" w:lineRule="auto"/>
+              <w:jc w:val="center"/>
+            </w:pPr>
+            <w:r/>
+            <w:r>
+              <w:rPr>
+                <w:sz w:val="18"/>
+              </w:rPr>
+              <w:t>413 / 2,407</w:t>
+            </w:r>
+          </w:p>
+        </w:tc>
       </w:tr>
       <w:tr>
         <w:trPr>
@@ -7322,7 +7472,7 @@
         </w:trPr>
         <w:tc>
           <w:tcPr>
-            <w:tcW w:type="dxa" w:w="2736"/>
+            <w:tcW w:type="dxa" w:w="2448"/>
           </w:tcPr>
           <w:p>
             <w:pPr>
@@ -7340,7 +7490,7 @@
         </w:tc>
         <w:tc>
           <w:tcPr>
-            <w:tcW w:type="dxa" w:w="1656"/>
+            <w:tcW w:type="dxa" w:w="1368"/>
           </w:tcPr>
           <w:p>
             <w:pPr>
@@ -7359,7 +7509,7 @@
         </w:tc>
         <w:tc>
           <w:tcPr>
-            <w:tcW w:type="dxa" w:w="1656"/>
+            <w:tcW w:type="dxa" w:w="1368"/>
           </w:tcPr>
           <w:p>
             <w:pPr>
@@ -7378,7 +7528,7 @@
         </w:tc>
         <w:tc>
           <w:tcPr>
-            <w:tcW w:type="dxa" w:w="1656"/>
+            <w:tcW w:type="dxa" w:w="1368"/>
           </w:tcPr>
           <w:p>
             <w:pPr>
@@ -7397,7 +7547,7 @@
         </w:tc>
         <w:tc>
           <w:tcPr>
-            <w:tcW w:type="dxa" w:w="1656"/>
+            <w:tcW w:type="dxa" w:w="1368"/>
           </w:tcPr>
           <w:p>
             <w:pPr>
@@ -7414,6 +7564,25 @@
             </w:r>
           </w:p>
         </w:tc>
+        <w:tc>
+          <w:tcPr>
+            <w:tcW w:type="dxa" w:w="1440"/>
+          </w:tcPr>
+          <w:p>
+            <w:pPr>
+              <w:keepNext/>
+              <w:spacing w:after="0" w:line="240" w:lineRule="auto"/>
+              <w:jc w:val="center"/>
+            </w:pPr>
+            <w:r/>
+            <w:r>
+              <w:rPr>
+                <w:sz w:val="18"/>
+              </w:rPr>
+              <w:t>628 / 1,975</w:t>
+            </w:r>
+          </w:p>
+        </w:tc>
       </w:tr>
       <w:tr>
         <w:trPr>
@@ -7421,7 +7590,7 @@
         </w:trPr>
         <w:tc>
           <w:tcPr>
-            <w:tcW w:type="dxa" w:w="2736"/>
+            <w:tcW w:type="dxa" w:w="2448"/>
           </w:tcPr>
           <w:p>
             <w:pPr>
@@ -7439,7 +7608,7 @@
         </w:tc>
         <w:tc>
           <w:tcPr>
-            <w:tcW w:type="dxa" w:w="1656"/>
+            <w:tcW w:type="dxa" w:w="1368"/>
           </w:tcPr>
           <w:p>
             <w:pPr>
@@ -7458,7 +7627,7 @@
         </w:tc>
         <w:tc>
           <w:tcPr>
-            <w:tcW w:type="dxa" w:w="1656"/>
+            <w:tcW w:type="dxa" w:w="1368"/>
           </w:tcPr>
           <w:p>
             <w:pPr>
@@ -7477,7 +7646,7 @@
         </w:tc>
         <w:tc>
           <w:tcPr>
-            <w:tcW w:type="dxa" w:w="1656"/>
+            <w:tcW w:type="dxa" w:w="1368"/>
           </w:tcPr>
           <w:p>
             <w:pPr>
@@ -7496,7 +7665,7 @@
         </w:tc>
         <w:tc>
           <w:tcPr>
-            <w:tcW w:type="dxa" w:w="1656"/>
+            <w:tcW w:type="dxa" w:w="1368"/>
           </w:tcPr>
           <w:p>
             <w:pPr>
@@ -7513,6 +7682,25 @@
             </w:r>
           </w:p>
         </w:tc>
+        <w:tc>
+          <w:tcPr>
+            <w:tcW w:type="dxa" w:w="1440"/>
+          </w:tcPr>
+          <w:p>
+            <w:pPr>
+              <w:keepNext/>
+              <w:spacing w:after="0" w:line="240" w:lineRule="auto"/>
+              <w:jc w:val="center"/>
+            </w:pPr>
+            <w:r/>
+            <w:r>
+              <w:rPr>
+                <w:sz w:val="18"/>
+              </w:rPr>
+              <w:t>540 / 2,032</w:t>
+            </w:r>
+          </w:p>
+        </w:tc>
       </w:tr>
       <w:tr>
         <w:trPr>
@@ -7520,7 +7708,7 @@
         </w:trPr>
         <w:tc>
           <w:tcPr>
-            <w:tcW w:type="dxa" w:w="2736"/>
+            <w:tcW w:type="dxa" w:w="2448"/>
           </w:tcPr>
           <w:p>
             <w:pPr>
@@ -7538,7 +7726,7 @@
         </w:tc>
         <w:tc>
           <w:tcPr>
-            <w:tcW w:type="dxa" w:w="1656"/>
+            <w:tcW w:type="dxa" w:w="1368"/>
           </w:tcPr>
           <w:p>
             <w:pPr>
@@ -7557,7 +7745,7 @@
         </w:tc>
         <w:tc>
           <w:tcPr>
-            <w:tcW w:type="dxa" w:w="1656"/>
+            <w:tcW w:type="dxa" w:w="1368"/>
           </w:tcPr>
           <w:p>
             <w:pPr>
@@ -7576,7 +7764,7 @@
         </w:tc>
         <w:tc>
           <w:tcPr>
-            <w:tcW w:type="dxa" w:w="1656"/>
+            <w:tcW w:type="dxa" w:w="1368"/>
           </w:tcPr>
           <w:p>
             <w:pPr>
@@ -7595,7 +7783,7 @@
         </w:tc>
         <w:tc>
           <w:tcPr>
-            <w:tcW w:type="dxa" w:w="1656"/>
+            <w:tcW w:type="dxa" w:w="1368"/>
           </w:tcPr>
           <w:p>
             <w:pPr>
@@ -7612,6 +7800,25 @@
             </w:r>
           </w:p>
         </w:tc>
+        <w:tc>
+          <w:tcPr>
+            <w:tcW w:type="dxa" w:w="1440"/>
+          </w:tcPr>
+          <w:p>
+            <w:pPr>
+              <w:keepNext/>
+              <w:spacing w:after="0" w:line="240" w:lineRule="auto"/>
+              <w:jc w:val="center"/>
+            </w:pPr>
+            <w:r/>
+            <w:r>
+              <w:rPr>
+                <w:sz w:val="18"/>
+              </w:rPr>
+              <w:t>3,226 (all)</w:t>
+            </w:r>
+          </w:p>
+        </w:tc>
       </w:tr>
       <w:tr>
         <w:trPr>
@@ -7619,7 +7826,7 @@
         </w:trPr>
         <w:tc>
           <w:tcPr>
-            <w:tcW w:type="dxa" w:w="2736"/>
+            <w:tcW w:type="dxa" w:w="2448"/>
           </w:tcPr>
           <w:p>
             <w:pPr>
@@ -7637,7 +7844,7 @@
         </w:tc>
         <w:tc>
           <w:tcPr>
-            <w:tcW w:type="dxa" w:w="1656"/>
+            <w:tcW w:type="dxa" w:w="1368"/>
           </w:tcPr>
           <w:p>
             <w:pPr>
@@ -7656,7 +7863,7 @@
         </w:tc>
         <w:tc>
           <w:tcPr>
-            <w:tcW w:type="dxa" w:w="1656"/>
+            <w:tcW w:type="dxa" w:w="1368"/>
           </w:tcPr>
           <w:p>
             <w:pPr>
@@ -7675,7 +7882,7 @@
         </w:tc>
         <w:tc>
           <w:tcPr>
-            <w:tcW w:type="dxa" w:w="1656"/>
+            <w:tcW w:type="dxa" w:w="1368"/>
           </w:tcPr>
           <w:p>
             <w:pPr>
@@ -7694,7 +7901,7 @@
         </w:tc>
         <w:tc>
           <w:tcPr>
-            <w:tcW w:type="dxa" w:w="1656"/>
+            <w:tcW w:type="dxa" w:w="1368"/>
           </w:tcPr>
           <w:p>
             <w:pPr>
@@ -7711,6 +7918,25 @@
             </w:r>
           </w:p>
         </w:tc>
+        <w:tc>
+          <w:tcPr>
+            <w:tcW w:type="dxa" w:w="1440"/>
+          </w:tcPr>
+          <w:p>
+            <w:pPr>
+              <w:keepNext/>
+              <w:spacing w:after="0" w:line="240" w:lineRule="auto"/>
+              <w:jc w:val="center"/>
+            </w:pPr>
+            <w:r/>
+            <w:r>
+              <w:rPr>
+                <w:sz w:val="18"/>
+              </w:rPr>
+              <w:t>628 / 2,412</w:t>
+            </w:r>
+          </w:p>
+        </w:tc>
       </w:tr>
       <w:tr>
         <w:trPr>
@@ -7718,7 +7944,7 @@
         </w:trPr>
         <w:tc>
           <w:tcPr>
-            <w:tcW w:type="dxa" w:w="2736"/>
+            <w:tcW w:type="dxa" w:w="2448"/>
           </w:tcPr>
           <w:p>
             <w:pPr>
@@ -7736,7 +7962,7 @@
         </w:tc>
         <w:tc>
           <w:tcPr>
-            <w:tcW w:type="dxa" w:w="1656"/>
+            <w:tcW w:type="dxa" w:w="1368"/>
           </w:tcPr>
           <w:p>
             <w:pPr>
@@ -7755,7 +7981,7 @@
         </w:tc>
         <w:tc>
           <w:tcPr>
-            <w:tcW w:type="dxa" w:w="1656"/>
+            <w:tcW w:type="dxa" w:w="1368"/>
           </w:tcPr>
           <w:p>
             <w:pPr>
@@ -7774,7 +8000,7 @@
         </w:tc>
         <w:tc>
           <w:tcPr>
-            <w:tcW w:type="dxa" w:w="1656"/>
+            <w:tcW w:type="dxa" w:w="1368"/>
           </w:tcPr>
           <w:p>
             <w:pPr>
@@ -7793,7 +8019,7 @@
         </w:tc>
         <w:tc>
           <w:tcPr>
-            <w:tcW w:type="dxa" w:w="1656"/>
+            <w:tcW w:type="dxa" w:w="1368"/>
           </w:tcPr>
           <w:p>
             <w:pPr>
@@ -7810,6 +8036,25 @@
             </w:r>
           </w:p>
         </w:tc>
+        <w:tc>
+          <w:tcPr>
+            <w:tcW w:type="dxa" w:w="1440"/>
+          </w:tcPr>
+          <w:p>
+            <w:pPr>
+              <w:keepNext/>
+              <w:spacing w:after="0" w:line="240" w:lineRule="auto"/>
+              <w:jc w:val="center"/>
+            </w:pPr>
+            <w:r/>
+            <w:r>
+              <w:rPr>
+                <w:sz w:val="18"/>
+              </w:rPr>
+              <w:t>567 / 2,156</w:t>
+            </w:r>
+          </w:p>
+        </w:tc>
       </w:tr>
       <w:tr>
         <w:trPr>
@@ -7817,7 +8062,7 @@
         </w:trPr>
         <w:tc>
           <w:tcPr>
-            <w:tcW w:type="dxa" w:w="2736"/>
+            <w:tcW w:type="dxa" w:w="2448"/>
           </w:tcPr>
           <w:p>
             <w:pPr>
@@ -7835,7 +8080,7 @@
         </w:tc>
         <w:tc>
           <w:tcPr>
-            <w:tcW w:type="dxa" w:w="1656"/>
+            <w:tcW w:type="dxa" w:w="1368"/>
           </w:tcPr>
           <w:p>
             <w:pPr>
@@ -7854,7 +8099,7 @@
         </w:tc>
         <w:tc>
           <w:tcPr>
-            <w:tcW w:type="dxa" w:w="1656"/>
+            <w:tcW w:type="dxa" w:w="1368"/>
           </w:tcPr>
           <w:p>
             <w:pPr>
@@ -7873,7 +8118,7 @@
         </w:tc>
         <w:tc>
           <w:tcPr>
-            <w:tcW w:type="dxa" w:w="1656"/>
+            <w:tcW w:type="dxa" w:w="1368"/>
           </w:tcPr>
           <w:p>
             <w:pPr>
@@ -7892,7 +8137,7 @@
         </w:tc>
         <w:tc>
           <w:tcPr>
-            <w:tcW w:type="dxa" w:w="1656"/>
+            <w:tcW w:type="dxa" w:w="1368"/>
           </w:tcPr>
           <w:p>
             <w:pPr>
@@ -7909,6 +8154,25 @@
             </w:r>
           </w:p>
         </w:tc>
+        <w:tc>
+          <w:tcPr>
+            <w:tcW w:type="dxa" w:w="1440"/>
+          </w:tcPr>
+          <w:p>
+            <w:pPr>
+              <w:keepNext/>
+              <w:spacing w:after="0" w:line="240" w:lineRule="auto"/>
+              <w:jc w:val="center"/>
+            </w:pPr>
+            <w:r/>
+            <w:r>
+              <w:rPr>
+                <w:sz w:val="18"/>
+              </w:rPr>
+              <w:t>256 / 1,926</w:t>
+            </w:r>
+          </w:p>
+        </w:tc>
       </w:tr>
       <w:tr>
         <w:trPr>
@@ -7916,7 +8180,7 @@
         </w:trPr>
         <w:tc>
           <w:tcPr>
-            <w:tcW w:type="dxa" w:w="2736"/>
+            <w:tcW w:type="dxa" w:w="2448"/>
           </w:tcPr>
           <w:p>
             <w:pPr>
@@ -7934,7 +8198,7 @@
         </w:tc>
         <w:tc>
           <w:tcPr>
-            <w:tcW w:type="dxa" w:w="1656"/>
+            <w:tcW w:type="dxa" w:w="1368"/>
           </w:tcPr>
           <w:p>
             <w:pPr>
@@ -7953,7 +8217,7 @@
         </w:tc>
         <w:tc>
           <w:tcPr>
-            <w:tcW w:type="dxa" w:w="1656"/>
+            <w:tcW w:type="dxa" w:w="1368"/>
           </w:tcPr>
           <w:p>
             <w:pPr>
@@ -7972,7 +8236,7 @@
         </w:tc>
         <w:tc>
           <w:tcPr>
-            <w:tcW w:type="dxa" w:w="1656"/>
+            <w:tcW w:type="dxa" w:w="1368"/>
           </w:tcPr>
           <w:p>
             <w:pPr>
@@ -7991,7 +8255,7 @@
         </w:tc>
         <w:tc>
           <w:tcPr>
-            <w:tcW w:type="dxa" w:w="1656"/>
+            <w:tcW w:type="dxa" w:w="1368"/>
           </w:tcPr>
           <w:p>
             <w:pPr>
@@ -8008,6 +8272,25 @@
             </w:r>
           </w:p>
         </w:tc>
+        <w:tc>
+          <w:tcPr>
+            <w:tcW w:type="dxa" w:w="1440"/>
+          </w:tcPr>
+          <w:p>
+            <w:pPr>
+              <w:keepNext/>
+              <w:spacing w:after="0" w:line="240" w:lineRule="auto"/>
+              <w:jc w:val="center"/>
+            </w:pPr>
+            <w:r/>
+            <w:r>
+              <w:rPr>
+                <w:sz w:val="18"/>
+              </w:rPr>
+              <w:t>646 / 2,412</w:t>
+            </w:r>
+          </w:p>
+        </w:tc>
       </w:tr>
       <w:tr>
         <w:trPr>
@@ -8015,7 +8298,7 @@
         </w:trPr>
         <w:tc>
           <w:tcPr>
-            <w:tcW w:type="dxa" w:w="2736"/>
+            <w:tcW w:type="dxa" w:w="2448"/>
           </w:tcPr>
           <w:p>
             <w:pPr>
@@ -8033,7 +8316,7 @@
         </w:tc>
         <w:tc>
           <w:tcPr>
-            <w:tcW w:type="dxa" w:w="1656"/>
+            <w:tcW w:type="dxa" w:w="1368"/>
           </w:tcPr>
           <w:p>
             <w:pPr>
@@ -8052,7 +8335,7 @@
         </w:tc>
         <w:tc>
           <w:tcPr>
-            <w:tcW w:type="dxa" w:w="1656"/>
+            <w:tcW w:type="dxa" w:w="1368"/>
           </w:tcPr>
           <w:p>
             <w:pPr>
@@ -8071,7 +8354,7 @@
         </w:tc>
         <w:tc>
           <w:tcPr>
-            <w:tcW w:type="dxa" w:w="1656"/>
+            <w:tcW w:type="dxa" w:w="1368"/>
           </w:tcPr>
           <w:p>
             <w:pPr>
@@ -8090,7 +8373,7 @@
         </w:tc>
         <w:tc>
           <w:tcPr>
-            <w:tcW w:type="dxa" w:w="1656"/>
+            <w:tcW w:type="dxa" w:w="1368"/>
           </w:tcPr>
           <w:p>
             <w:pPr>
@@ -8107,6 +8390,25 @@
             </w:r>
           </w:p>
         </w:tc>
+        <w:tc>
+          <w:tcPr>
+            <w:tcW w:type="dxa" w:w="1440"/>
+          </w:tcPr>
+          <w:p>
+            <w:pPr>
+              <w:keepNext/>
+              <w:spacing w:after="0" w:line="240" w:lineRule="auto"/>
+              <w:jc w:val="center"/>
+            </w:pPr>
+            <w:r/>
+            <w:r>
+              <w:rPr>
+                <w:sz w:val="18"/>
+              </w:rPr>
+              <w:t>273 / 2,032</w:t>
+            </w:r>
+          </w:p>
+        </w:tc>
       </w:tr>
       <w:tr>
         <w:trPr>
@@ -8114,7 +8416,7 @@
         </w:trPr>
         <w:tc>
           <w:tcPr>
-            <w:tcW w:type="dxa" w:w="2736"/>
+            <w:tcW w:type="dxa" w:w="2448"/>
           </w:tcPr>
           <w:p>
             <w:pPr>
@@ -8132,7 +8434,7 @@
         </w:tc>
         <w:tc>
           <w:tcPr>
-            <w:tcW w:type="dxa" w:w="1656"/>
+            <w:tcW w:type="dxa" w:w="1368"/>
           </w:tcPr>
           <w:p>
             <w:pPr>
@@ -8151,7 +8453,7 @@
         </w:tc>
         <w:tc>
           <w:tcPr>
-            <w:tcW w:type="dxa" w:w="1656"/>
+            <w:tcW w:type="dxa" w:w="1368"/>
           </w:tcPr>
           <w:p>
             <w:pPr>
@@ -8170,7 +8472,7 @@
         </w:tc>
         <w:tc>
           <w:tcPr>
-            <w:tcW w:type="dxa" w:w="1656"/>
+            <w:tcW w:type="dxa" w:w="1368"/>
           </w:tcPr>
           <w:p>
             <w:pPr>
@@ -8189,7 +8491,7 @@
         </w:tc>
         <w:tc>
           <w:tcPr>
-            <w:tcW w:type="dxa" w:w="1656"/>
+            <w:tcW w:type="dxa" w:w="1368"/>
           </w:tcPr>
           <w:p>
             <w:pPr>
@@ -8206,6 +8508,25 @@
             </w:r>
           </w:p>
         </w:tc>
+        <w:tc>
+          <w:tcPr>
+            <w:tcW w:type="dxa" w:w="1440"/>
+          </w:tcPr>
+          <w:p>
+            <w:pPr>
+              <w:keepNext/>
+              <w:spacing w:after="0" w:line="240" w:lineRule="auto"/>
+              <w:jc w:val="center"/>
+            </w:pPr>
+            <w:r/>
+            <w:r>
+              <w:rPr>
+                <w:sz w:val="18"/>
+              </w:rPr>
+              <w:t>312</w:t>
+            </w:r>
+          </w:p>
+        </w:tc>
       </w:tr>
       <w:tr>
         <w:trPr>
@@ -8213,7 +8534,7 @@
         </w:trPr>
         <w:tc>
           <w:tcPr>
-            <w:tcW w:type="dxa" w:w="2736"/>
+            <w:tcW w:type="dxa" w:w="2448"/>
           </w:tcPr>
           <w:p>
             <w:pPr>
@@ -8231,7 +8552,7 @@
         </w:tc>
         <w:tc>
           <w:tcPr>
-            <w:tcW w:type="dxa" w:w="1656"/>
+            <w:tcW w:type="dxa" w:w="1368"/>
           </w:tcPr>
           <w:p>
             <w:pPr>
@@ -8250,7 +8571,7 @@
         </w:tc>
         <w:tc>
           <w:tcPr>
-            <w:tcW w:type="dxa" w:w="1656"/>
+            <w:tcW w:type="dxa" w:w="1368"/>
           </w:tcPr>
           <w:p>
             <w:pPr>
@@ -8269,7 +8590,7 @@
         </w:tc>
         <w:tc>
           <w:tcPr>
-            <w:tcW w:type="dxa" w:w="1656"/>
+            <w:tcW w:type="dxa" w:w="1368"/>
           </w:tcPr>
           <w:p>
             <w:pPr>
@@ -8288,7 +8609,7 @@
         </w:tc>
         <w:tc>
           <w:tcPr>
-            <w:tcW w:type="dxa" w:w="1656"/>
+            <w:tcW w:type="dxa" w:w="1368"/>
           </w:tcPr>
           <w:p>
             <w:pPr>
@@ -8305,6 +8626,25 @@
             </w:r>
           </w:p>
         </w:tc>
+        <w:tc>
+          <w:tcPr>
+            <w:tcW w:type="dxa" w:w="1440"/>
+          </w:tcPr>
+          <w:p>
+            <w:pPr>
+              <w:keepNext/>
+              <w:spacing w:after="0" w:line="240" w:lineRule="auto"/>
+              <w:jc w:val="center"/>
+            </w:pPr>
+            <w:r/>
+            <w:r>
+              <w:rPr>
+                <w:sz w:val="18"/>
+              </w:rPr>
+              <w:t>316</w:t>
+            </w:r>
+          </w:p>
+        </w:tc>
       </w:tr>
       <w:tr>
         <w:trPr>
@@ -8312,7 +8652,7 @@
         </w:trPr>
         <w:tc>
           <w:tcPr>
-            <w:tcW w:type="dxa" w:w="2736"/>
+            <w:tcW w:type="dxa" w:w="2448"/>
             <w:tcBorders>
               <w:bottom w:val="single" w:sz="6" w:color="000000"/>
             </w:tcBorders>
@@ -8332,7 +8672,7 @@
         </w:tc>
         <w:tc>
           <w:tcPr>
-            <w:tcW w:type="dxa" w:w="1656"/>
+            <w:tcW w:type="dxa" w:w="1368"/>
             <w:tcBorders>
               <w:bottom w:val="single" w:sz="6" w:color="000000"/>
             </w:tcBorders>
@@ -8353,7 +8693,7 @@
         </w:tc>
         <w:tc>
           <w:tcPr>
-            <w:tcW w:type="dxa" w:w="1656"/>
+            <w:tcW w:type="dxa" w:w="1368"/>
             <w:tcBorders>
               <w:bottom w:val="single" w:sz="6" w:color="000000"/>
             </w:tcBorders>
@@ -8374,7 +8714,7 @@
         </w:tc>
         <w:tc>
           <w:tcPr>
-            <w:tcW w:type="dxa" w:w="1656"/>
+            <w:tcW w:type="dxa" w:w="1368"/>
             <w:tcBorders>
               <w:bottom w:val="single" w:sz="6" w:color="000000"/>
             </w:tcBorders>
@@ -8395,7 +8735,7 @@
         </w:tc>
         <w:tc>
           <w:tcPr>
-            <w:tcW w:type="dxa" w:w="1656"/>
+            <w:tcW w:type="dxa" w:w="1368"/>
             <w:tcBorders>
               <w:bottom w:val="single" w:sz="6" w:color="000000"/>
             </w:tcBorders>
@@ -8414,6 +8754,21 @@
             </w:r>
           </w:p>
         </w:tc>
+        <w:tc>
+          <w:tcPr>
+            <w:tcW w:type="dxa" w:w="1440"/>
+            <w:tcBorders>
+              <w:bottom w:val="single" w:sz="6" w:color="000000"/>
+            </w:tcBorders>
+          </w:tcPr>
+          <w:p>
+            <w:pPr>
+              <w:spacing w:after="0" w:line="240" w:lineRule="auto"/>
+              <w:jc w:val="center"/>
+            </w:pPr>
+            <w:r/>
+          </w:p>
+        </w:tc>
       </w:tr>
     </w:tbl>
     <w:p>
@@ -8432,7 +8787,7 @@
           <w:color w:val="0000FF"/>
           <w:sz w:val="18"/>
         </w:rPr>
-        <w:t xml:space="preserve">Effects over event years 0 to 3 (R5: </w:t>
+        <w:t xml:space="preserve">Outcome-regression changes over event years 0 to 3 (R5: </w:t>
       </w:r>
       <w:r>
         <w:rPr>
@@ -8478,13 +8833,13 @@
           <w:color w:val="0000FF"/>
           <w:sz w:val="18"/>
         </w:rPr>
-        <w:t>11, firm-clustered) with bootstrap standard errors in parentheses. *, **, ***:</w:t>
+        <w:t>11, firm-clustered), firm-bootstrap standard errors; firm counts for ln(MTB). *, **, ***:</w:t>
       </w:r>
       <w:r>
         <w:rPr>
           <w:sz w:val="18"/>
         </w:rPr>
-        <w:t xml:space="preserve"> 10%, 5%, 1% significance (unadjusted).</w:t>
+        <w:t xml:space="preserve"> 10%, 5%, 1%.</w:t>
       </w:r>
     </w:p>
     <w:p>
@@ -8583,7 +8938,7 @@
         <w:rPr>
           <w:color w:val="0000FF"/>
         </w:rPr>
-        <w:t>In Malaysia, where the expansion was broadest, the median total assets of scored firms were 3.3 times those of the 565 never-scored firms.</w:t>
+        <w:t>In Malaysia, where the expansion was broadest, the median total assets of scored firms, each firm measured by its median over all sample years, were 3.3 times those of the 565 never-scored firms.</w:t>
       </w:r>
     </w:p>
     <w:p>
@@ -8721,7 +9076,7 @@
         <w:rPr>
           <w:color w:val="0000FF"/>
         </w:rPr>
-        <w:t>The 289 Malaysian firms first scored in 2021 and 2022 show no run-up (pre-trend p = 0.549), and the 278 firms in the remaining cohorts fall in between.</w:t>
+        <w:t>The 289 Malaysian firms first scored in 2021 and 2022 show no detectable run-up:</w:t>
       </w:r>
       <w:r>
         <w:rPr/>
@@ -8731,7 +9086,17 @@
         <w:rPr>
           <w:color w:val="0000FF"/>
         </w:rPr>
-        <w:t>After the first recorded score, no wave shows an MTB gain (Table S10), while market capitalization fell in the Malaysian wave (−0.146, p = 0.005), which accounts for the negative pooled market capitalization estimate.</w:t>
+        <w:t>2.8% (95% interval −7.4% to 15.2%; pre-trend p = 0.549), so a run-up of the pooled size cannot be ruled out for this wave, and the 278 firms in the remaining cohorts fall in between.</w:t>
+      </w:r>
+      <w:r>
+        <w:rPr/>
+        <w:t xml:space="preserve"> </w:t>
+      </w:r>
+      <w:r>
+        <w:rPr>
+          <w:color w:val="0000FF"/>
+        </w:rPr>
+        <w:t>After the first recorded score, no wave shows a detectable MTB gain (Table S10), while market capitalization fell in the Malaysian wave (−0.146, p = 0.005), which accounts for the negative pooled market capitalization estimate.</w:t>
       </w:r>
     </w:p>
     <w:p>
@@ -8915,7 +9280,7 @@
         <w:rPr>
           <w:color w:val="0000FF"/>
         </w:rPr>
-        <w:t>Row 2 keeps only firms observed in both g − 1 and g, so that the same firms enter every later row; this changes the MTB estimate by −0.005.</w:t>
+        <w:t>Row 2 keeps only firms observed in both g − 1 and g, so that every later row draws on the same set of firms (a few drop out when the window or the size measure changes); this changes the MTB estimate by −0.005.</w:t>
       </w:r>
       <w:r>
         <w:rPr/>
@@ -8939,7 +9304,17 @@
       </w:r>
       <w:r>
         <w:rPr/>
-        <w:t xml:space="preserve"> Measuring size in g instead of g − 1 (row 5) and returning to all firms (row 6) change little.</w:t>
+        <w:t xml:space="preserve"> </w:t>
+      </w:r>
+      <w:r>
+        <w:rPr>
+          <w:color w:val="0000FF"/>
+        </w:rPr>
+        <w:t>Measuring size in g instead of g − 1 (row 5) and returning to all firms (row 6) change little.</w:t>
+      </w:r>
+      <w:r>
+        <w:rPr/>
+        <w:t xml:space="preserve"> The steps are sequential, so the shares depend on their order; we take the window step before the reference step.</w:t>
       </w:r>
     </w:p>
     <w:p>
@@ -9075,7 +9450,7 @@
                 <w:color w:val="0000FF"/>
                 <w:sz w:val="18"/>
               </w:rPr>
-              <w:t>Scored firms</w:t>
+              <w:t>Scored firms in averaged event years</w:t>
             </w:r>
           </w:p>
         </w:tc>
@@ -9435,7 +9810,7 @@
                 <w:color w:val="0000FF"/>
                 <w:sz w:val="18"/>
               </w:rPr>
-              <w:t>(5) As (4), size measured in g (one year later, same firms)</w:t>
+              <w:t>(5) As (4), size measured in g</w:t>
             </w:r>
           </w:p>
         </w:tc>
@@ -9939,7 +10314,7 @@
           <w:color w:val="0000FF"/>
           <w:sz w:val="18"/>
         </w:rPr>
-        <w:t>Note: Outcome-regression effects with bootstrap standard errors in parentheses; each row changes one feature of the row it names. *, **, ***: 10%, 5%, 1% significance.</w:t>
+        <w:t>Note: Outcome-regression changes, firm-bootstrap standard errors in parentheses; each row changes one feature. *, **, ***: 10%, 5%, 1%.</w:t>
       </w:r>
     </w:p>
     <w:p>
@@ -9980,7 +10355,7 @@
         <w:rPr>
           <w:color w:val="0000FF"/>
         </w:rPr>
-        <w:t>In the cohorts that contribute to event years 1 to 4, the MTB ratio of scored firms rose by 0.044 relative to never-scored firms between g − 1 and g, and row 4 subtracts exactly this rise, so a later dating starts from a higher point.</w:t>
+        <w:t>Moving the reference year from g − 1 to g subtracts from each later estimate the change in log MTB of the same scored firms, relative to the same never-scored firms, between g − 1 and g.</w:t>
       </w:r>
       <w:r>
         <w:rPr/>
@@ -9990,7 +10365,7 @@
         <w:rPr>
           <w:color w:val="0000FF"/>
         </w:rPr>
-        <w:t>The cohorts observed through event year 4 (rows 7 to 10) show the same pattern more strongly.</w:t>
+        <w:t>The row 4 step is therefore this event-year-0 change, 0.044, averaged with the weights that the cohorts receive in event years 1 to 4; it is an accounting identity, not a separate estimate.</w:t>
       </w:r>
       <w:r>
         <w:rPr/>
@@ -10000,7 +10375,7 @@
         <w:rPr>
           <w:color w:val="0000FF"/>
         </w:rPr>
-        <w:t>Composition matters as well: the timing difference is concentrated in the waves that had a run-up.</w:t>
+        <w:t>A later dating thus starts from a higher point, and part of the decline it reports is the rise in the first recorded year itself.</w:t>
       </w:r>
       <w:r>
         <w:rPr/>
@@ -10010,11 +10385,31 @@
         <w:rPr>
           <w:color w:val="0000FF"/>
         </w:rPr>
+        <w:t>The cohorts observed through event year 4 (rows 7 to 10) show the same pattern more strongly.</w:t>
+      </w:r>
+      <w:r>
+        <w:rPr/>
+        <w:t xml:space="preserve"> </w:t>
+      </w:r>
+      <w:r>
+        <w:rPr>
+          <w:color w:val="0000FF"/>
+        </w:rPr>
+        <w:t>Composition matters as well: the timing difference is concentrated in the waves that had a run-up.</w:t>
+      </w:r>
+      <w:r>
+        <w:rPr/>
+        <w:t xml:space="preserve"> </w:t>
+      </w:r>
+      <w:r>
+        <w:rPr>
+          <w:color w:val="0000FF"/>
+        </w:rPr>
         <w:t>Table S10 of the supplementary material shows that under the one-year-later dating the MTB change is −0.136 for the Thai and Singaporean wave and −0.111 for the remaining cohorts, but 0.012 for the Malaysian wave, whose estimate under the first recorded year is 0.021.</w:t>
       </w:r>
       <w:r>
         <w:rPr/>
-        <w:t xml:space="preserve"> Where valuations did not run up before entry, neither dating detects an MTB change (95% intervals −0.053 to 0.091 and −0.055 to 0.076).</w:t>
+        <w:t xml:space="preserve"> Where no run-up was detected before entry, neither dating detects an MTB change (95% intervals −0.053 to 0.091 and −0.055 to 0.076).</w:t>
       </w:r>
     </w:p>
     <w:p>
@@ -10370,7 +10765,7 @@
                 <w:color w:val="0000FF"/>
                 <w:sz w:val="18"/>
               </w:rPr>
-              <w:t>Scored firms</w:t>
+              <w:t>Scored firms in averaged event years</w:t>
             </w:r>
           </w:p>
         </w:tc>
@@ -11318,7 +11713,7 @@
           <w:color w:val="0000FF"/>
           <w:sz w:val="18"/>
         </w:rPr>
-        <w:t>Note: Bootstrap standard errors in parentheses; percentile rows cap scored firms' base-year assets at that control percentile. *, **, ***: 10%, 5%, 1% significance.</w:t>
+        <w:t>Note: Outcome regression unless labeled doubly robust, firm-bootstrap standard errors in parentheses; *, **, ***: 10%, 5%, 1%. Percentile rows cap scored firms' base-year assets at that control percentile.</w:t>
       </w:r>
     </w:p>
     <w:p>
@@ -11349,7 +11744,7 @@
         <w:rPr>
           <w:color w:val="0000FF"/>
         </w:rPr>
-        <w:t>Its estimate is 0.016 without covariates and between −0.096 and −0.033 with them, so the negative market capitalization change depends on how size is modeled.</w:t>
+        <w:t>Its estimate is 0.016 without covariates, between −0.059 and −0.033 across the functional forms that adjust for size, and between −0.096 and −0.061 on the restricted supports, so the negative market capitalization change depends on how size is modeled.</w:t>
       </w:r>
       <w:r>
         <w:rPr/>
@@ -12783,7 +13178,7 @@
                 <w:color w:val="0000FF"/>
                 <w:sz w:val="18"/>
               </w:rPr>
-              <w:t>Scored firms</w:t>
+              <w:t>Scored firms in averaged event years</w:t>
             </w:r>
           </w:p>
         </w:tc>
@@ -13458,7 +13853,7 @@
           <w:color w:val="0000FF"/>
           <w:sz w:val="18"/>
         </w:rPr>
-        <w:t>Note: Bootstrap standard errors in parentheses; flags mark implied book equity above ten times assets (Section 3.4). *, **, ***: 10%, 5%, 1% significance.</w:t>
+        <w:t>Note: Outcome-regression changes, firm-bootstrap standard errors in parentheses; flags mark implied book equity above ten times assets (Section 3.4). *, **, ***: 10%, 5%, 1%.</w:t>
       </w:r>
     </w:p>
     <w:p>
@@ -13936,7 +14331,7 @@
         <w:rPr>
           <w:color w:val="0000FF"/>
         </w:rPr>
-        <w:t>U.S. studies find that coverage changes firm conduct and payout (Bikmetova &amp; Pirinsky, 2026;</w:t>
+        <w:t>Studies, mostly of U.S. firms, find that coverage changes firm conduct and payout (Bikmetova &amp; Pirinsky, 2026;</w:t>
       </w:r>
       <w:r>
         <w:rPr/>
@@ -14016,7 +14411,7 @@
         <w:rPr>
           <w:color w:val="0000FF"/>
         </w:rPr>
-        <w:t>For rating providers and data users, the scored universe in these markets tilts toward large firms and, outside the Malaysian wave, toward firms that had just outgrown their peers. Publishing the date on which each firm's coverage began, and keeping the vintages of revised scores, would separate what was known from what was filled in later.</w:t>
+        <w:t>For rating providers and data users, the scored universe in these markets tilts toward large firms and toward firms that had outgrown their peers, most clearly in the Thai and Singaporean wave. Publishing the date on which each firm's coverage began, and keeping the vintages of revised scores, would separate what was known from what was filled in later.</w:t>
       </w:r>
     </w:p>
     <w:p>
@@ -14165,7 +14560,17 @@
         <w:rPr>
           <w:color w:val="0000FF"/>
         </w:rPr>
-        <w:t>The firms that received a first recorded score were larger than never-scored firms, and outside the broad Malaysian wave of 2021 and 2022 their market-to-book ratio had grown faster than that of similar firms before entry, by 10.0% over five years.</w:t>
+        <w:t>The firms that received a first recorded score were larger than never-scored firms, and on average their market-to-book ratio had grown 10.0% faster than that of similar firms over the five years before entry.</w:t>
+      </w:r>
+      <w:r>
+        <w:rPr/>
+        <w:t xml:space="preserve"> </w:t>
+      </w:r>
+      <w:r>
+        <w:rPr>
+          <w:color w:val="0000FF"/>
+        </w:rPr>
+        <w:t>The run-up was concentrated in the Thai and Singaporean wave of 2019 and 2020 and was not detected in the broad Malaysian wave of 2021 and 2022 (95% interval −7.4% to 15.2%).</w:t>
       </w:r>
       <w:r>
         <w:rPr/>
@@ -14319,11 +14724,24 @@
         <w:rPr>
           <w:color w:val="0000FF"/>
         </w:rPr>
-        <w:t>(2020). *Is history repeating itself?</w:t>
+        <w:t xml:space="preserve">(2020). </w:t>
+      </w:r>
+      <w:r>
+        <w:rPr>
+          <w:i/>
+          <w:color w:val="0000FF"/>
+        </w:rPr>
+        <w:t>Is history repeating itself? The (un)predictable past of ESG ratings</w:t>
+      </w:r>
+      <w:r>
+        <w:rPr>
+          <w:color w:val="0000FF"/>
+        </w:rPr>
+        <w:t xml:space="preserve"> (Finance Working Paper No.</w:t>
       </w:r>
       <w:r>
         <w:rPr/>
-        <w:t xml:space="preserve"> The (un)predictable past of ESG ratings* (Finance Working Paper No. 708/2020). European Corporate Governance Institute. https://ssrn.com/abstract=3722087</w:t>
+        <w:t xml:space="preserve"> 708/2020). European Corporate Governance Institute. https://ssrn.com/abstract=3722087</w:t>
       </w:r>
     </w:p>
     <w:p>
@@ -15565,21 +15983,33 @@
         <w:rPr>
           <w:color w:val="0000FF"/>
         </w:rPr>
-        <w:t>Event-study estimates after testing for parallel trends. *American Economic Review:</w:t>
-      </w:r>
-      <w:r>
-        <w:rPr/>
-        <w:t xml:space="preserve"> Insights</w:t>
+        <w:t xml:space="preserve">Event-study estimates after testing for parallel trends. </w:t>
       </w:r>
       <w:r>
         <w:rPr>
           <w:i/>
+          <w:color w:val="0000FF"/>
+        </w:rPr>
+        <w:t>American Economic Review: Insights</w:t>
+      </w:r>
+      <w:r>
+        <w:rPr>
+          <w:color w:val="0000FF"/>
         </w:rPr>
         <w:t xml:space="preserve">, </w:t>
       </w:r>
       <w:r>
-        <w:rPr/>
-        <w:t>4*(3), 305–322. https://doi.org/10.1257/aeri.20210236</w:t>
+        <w:rPr>
+          <w:i/>
+          <w:color w:val="0000FF"/>
+        </w:rPr>
+        <w:t>4</w:t>
+      </w:r>
+      <w:r>
+        <w:rPr>
+          <w:color w:val="0000FF"/>
+        </w:rPr>
+        <w:t>(3), 305–322. https://doi.org/10.1257/aeri.20210236</w:t>
       </w:r>
     </w:p>
     <w:p>
@@ -15679,11 +16109,20 @@
         <w:rPr>
           <w:color w:val="0000FF"/>
         </w:rPr>
-        <w:t>(2019). *Memorandum Circular No.</w:t>
-      </w:r>
-      <w:r>
-        <w:rPr/>
-        <w:t xml:space="preserve"> 4, series of 2019: Sustainability reporting guidelines for publicly-listed companies*. https://www.sec.gov.ph/wp-content/uploads/2020/09/2019MCNo4.pdf</w:t>
+        <w:t xml:space="preserve">(2019). </w:t>
+      </w:r>
+      <w:r>
+        <w:rPr>
+          <w:i/>
+          <w:color w:val="0000FF"/>
+        </w:rPr>
+        <w:t>Memorandum Circular No. 4, series of 2019: Sustainability reporting guidelines for publicly-listed companies</w:t>
+      </w:r>
+      <w:r>
+        <w:rPr>
+          <w:color w:val="0000FF"/>
+        </w:rPr>
+        <w:t>. https://www.sec.gov.ph/wp-content/uploads/2020/09/2019MCNo4.pdf</w:t>
       </w:r>
     </w:p>
     <w:p>
@@ -15783,11 +16222,24 @@
         <w:rPr>
           <w:color w:val="0000FF"/>
         </w:rPr>
-        <w:t>(2016). *SGX Mainboard Rules 711A and 711B:</w:t>
+        <w:t xml:space="preserve">(2016). </w:t>
+      </w:r>
+      <w:r>
+        <w:rPr>
+          <w:i/>
+          <w:color w:val="0000FF"/>
+        </w:rPr>
+        <w:t>SGX Mainboard Rules 711A and 711B: Sustainability report</w:t>
+      </w:r>
+      <w:r>
+        <w:rPr>
+          <w:color w:val="0000FF"/>
+        </w:rPr>
+        <w:t xml:space="preserve"> [Listing rules].</w:t>
       </w:r>
       <w:r>
         <w:rPr/>
-        <w:t xml:space="preserve"> Sustainability report* [Listing rules]. SGX Rulebook. https://rulebook.sgx.com/rulebook/711a</w:t>
+        <w:t xml:space="preserve"> SGX Rulebook. https://rulebook.sgx.com/rulebook/711a</w:t>
       </w:r>
     </w:p>
     <w:p>
@@ -15945,21 +16397,33 @@
         <w:rPr>
           <w:color w:val="0000FF"/>
         </w:rPr>
-        <w:t>Evidence from the initiation of nonfinancial agency coverage. *Corporate Governance:</w:t>
-      </w:r>
-      <w:r>
-        <w:rPr/>
-        <w:t xml:space="preserve"> An International Review</w:t>
+        <w:t xml:space="preserve">Evidence from the initiation of nonfinancial agency coverage. </w:t>
       </w:r>
       <w:r>
         <w:rPr>
           <w:i/>
+          <w:color w:val="0000FF"/>
+        </w:rPr>
+        <w:t>Corporate Governance: An International Review</w:t>
+      </w:r>
+      <w:r>
+        <w:rPr>
+          <w:color w:val="0000FF"/>
         </w:rPr>
         <w:t xml:space="preserve">, </w:t>
       </w:r>
       <w:r>
-        <w:rPr/>
-        <w:t>33*(4), 554–577. https://doi.org/10.1111/corg.12615</w:t>
+        <w:rPr>
+          <w:i/>
+          <w:color w:val="0000FF"/>
+        </w:rPr>
+        <w:t>33</w:t>
+      </w:r>
+      <w:r>
+        <w:rPr>
+          <w:color w:val="0000FF"/>
+        </w:rPr>
+        <w:t>(4), 554–577. https://doi.org/10.1111/corg.12615</w:t>
       </w:r>
     </w:p>
     <w:sectPr>

</xml_diff>